<commit_message>
Update KneeAssist research workflow and documentation
Co-authored-by: Copilot <223556219+Copilot@users.noreply.github.com>
</commit_message>
<xml_diff>
--- a/docs/academic/KneeAssist_AI_Five_Objective_Project_Report.docx
+++ b/docs/academic/KneeAssist_AI_Five_Objective_Project_Report.docx
@@ -36,7 +36,7 @@
         <w:jc w:val="center"/>
       </w:pPr>
       <w:r>
-        <w:t>KneeAssist AI development of a deep learning system for study level classification of normal and abnormal knee MRI studies</w:t>
+        <w:t>KneeAssist XAI development of an explainable deep learning system for study level classification of normal and abnormal knee MRI studies</w:t>
       </w:r>
     </w:p>
     <w:p>
@@ -174,7 +174,7 @@
     </w:p>
     <w:p>
       <w:r>
-        <w:t>Project title: KneeAssist AI development of a deep learning system for study level classification of normal and abnormal knee MRI studies</w:t>
+        <w:t>Project title: KneeAssist XAI development of an explainable deep learning system for study level classification of normal and abnormal knee MRI studies</w:t>
       </w:r>
     </w:p>
     <w:p>
@@ -213,7 +213,7 @@
     </w:p>
     <w:p>
       <w:r>
-        <w:t>Knee magnetic resonance imaging classification requires more than a model that produces plausible scores: data separation, reference labels and evaluation conditions determine what those scores can support. This project developed KneeAssist AI, a local research application whose primary task is study-level classification of normal and abnormal knee MRI studies. ACL tear and meniscal tear scores are retained as secondary research outputs. Five objectives addressed data preparation, comparative modelling, evaluation and calibration, independent inference, and interface verification. A retrospective computational design used MRNet as the sole training source, with 804 fitting, 226 internal tuning, 100 calibration and 120 official validation studies. ImageNet-pretrained ResNet-18 and EfficientNet-B0 encoders processed sampled slices from available imaging planes, followed by study-level aggregation and a multi-label classification head. The selected checkpoint was the frozen-encoder EfficientNet-B0 warm-up model; attempted fine-tuning and a separate five-family benchmark did not exceed its internal selection performance. The primary normal/abnormal output achieved AUROC of 0.901 on the official MRNet validation cohort. The interface supports prepared MRI arrays, cautious NIfTI input and guarded DICOM routes. Independent inference, Grad-CAM attention, MRI upload, export controls and case clearing were verified; release evidence recorded 33 passing tests and nine executed notebooks. A separate RSNA Kaggle pilot was not merged because only 58 studies had complete explicit labels. Patient linkage was unavailable, evaluation material had been reused, and external reference evidence was limited. The contribution is an auditable working research prototype with transparent limitations and reproducible artifacts, rather than a clinically validated diagnostic system. Independent patient-level evaluation and controlled robustness studies are recommended before stronger claims.</w:t>
+        <w:t>Knee magnetic resonance imaging classification requires more than a model that produces plausible scores: data separation, reference labels and evaluation conditions determine what those scores can support. This project developed KneeAssist XAI, a local explainable-AI research application whose primary task is study-level classification of normal and abnormal knee MRI studies. ACL tear and meniscal tear scores are retained as secondary research outputs. Five objectives addressed data preparation, comparative modelling, evaluation and calibration, independent inference, and interface verification. A retrospective computational design used MRNet as the sole training source, with 804 fitting, 226 internal tuning, 100 calibration and 120 official validation studies. ImageNet-pretrained ResNet-18 and EfficientNet-B0 encoders processed sampled slices from available imaging planes, followed by study-level aggregation and a multi-label classification head. The selected checkpoint was the frozen-encoder EfficientNet-B0 warm-up model; attempted fine-tuning and a separate five-family benchmark did not exceed its internal selection performance. The primary normal/abnormal output achieved AUROC of 0.901 on the official MRNet validation cohort. The interface supports prepared MRI arrays, cautious NIfTI input and guarded DICOM routes. Independent inference, Grad-CAM attention, MRI upload, export controls and case clearing were verified; release evidence recorded 33 passing tests and nine executed notebooks. A separate RSNA Kaggle pilot was not merged because only 58 studies had complete explicit labels. Patient linkage was unavailable, evaluation material had been reused, and external reference evidence was limited. The contribution is an auditable working research prototype with transparent limitations and reproducible artifacts, rather than a clinically validated diagnostic system. Independent patient-level evaluation and controlled robustness studies are recommended before stronger claims.</w:t>
       </w:r>
     </w:p>
     <w:p>
@@ -1250,7 +1250,7 @@
     </w:p>
     <w:p>
       <w:r>
-        <w:t>KneeAssist AI is a local research application that classifies a complete knee magnetic resonance imaging (MRI) study as normal or abnormal. The general-abnormality output is the primary academic task. ACL tear and meniscal tear scores are retained as secondary research outputs to show how the system can be extended when suitable labels are available. This report documents data preparation, model comparison, evaluation, explanation and the user interface. Its central question is whether a reproducible study-level normal/abnormal classifier can provide a transparent basis for research testing while making the limits of its predictions visible.</w:t>
+        <w:t>KneeAssist XAI is a local explainable-AI research application that classifies a complete knee magnetic resonance imaging (MRI) study as normal or abnormal. The general-abnormality output is the primary academic task. ACL tear and meniscal tear scores are retained as secondary research outputs to show how the system can be extended when suitable labels are available. The XAI component presents the selected model, study-level score and Grad-CAM attention for review; it does not confirm or precisely locate a lesion. This report documents data preparation, model comparison, evaluation, explanation and the user interface. Its central question is whether a reproducible study-level normal/abnormal classifier can provide a transparent basis for research testing while making the limits of its predictions visible.</w:t>
       </w:r>
     </w:p>
     <w:p>
@@ -2688,7 +2688,7 @@
     </w:p>
     <w:p>
       <w:r>
-        <w:t>Selvaraju et al. (2017) introduce Grad-CAM, which uses gradients to produce class-related visual localisation. KneeAssist AI uses this form of attention visualisation to accompany study scores. A highlighted region is not treated as a segmented tear or verified anatomical lesion.</w:t>
+        <w:t>Selvaraju et al. (2017) introduce Grad-CAM, which uses gradients to produce class-related visual localisation. KneeAssist XAI uses this form of attention visualisation to accompany study scores. A highlighted region is not treated as a segmented tear or verified anatomical lesion.</w:t>
       </w:r>
     </w:p>
     <w:p>
@@ -3389,7 +3389,7 @@
     </w:p>
     <w:p>
       <w:r>
-        <w:t>The primary experimental comparison is narrower than a benchmark competition. It compares ResNet-18 and EfficientNet-B0 under the project configuration and selects a checkpoint by internal AUROC. A later supplementary frozen-encoder benchmark also evaluated ResNet-50, DenseNet-121 and Swin Transformer under one locked split; it did not replace the primary selection or the active checkpoint. There is no multi-seed cross-validation, prospective trial or exhaustive hyperparameter search. These comparisons are informative only when their limitations remain attached to the reported results.</w:t>
+        <w:t>The formal primary comparison is narrower than a benchmark competition. It compares ResNet-18 and EfficientNet-B0 and selects the baseline by internal AUROC. A later portfolio evaluated ResNet-50, DenseNet-121 and Swin Transformer under one locked split. The current dashboard uses the portfolio only as fixed target-routing evidence: DenseNet-121 for general abnormality, ResNet-18 for ACL and Swin-T for meniscus when the MRI input is compatible. It does not choose a model from the uploaded study's prediction scores and it does not use a weighted ensemble. There is no multi-seed cross-validation, prospective trial or exhaustive hyperparameter search.</w:t>
       </w:r>
     </w:p>
     <w:p>
@@ -3867,7 +3867,7 @@
                 <w:b w:val="0"/>
                 <w:sz w:val="20"/>
               </w:rPr>
-              <w:t>KneeAssist AI release</w:t>
+              <w:t>KneeAssist XAI release</w:t>
             </w:r>
           </w:p>
         </w:tc>
@@ -3935,7 +3935,7 @@
     </w:p>
     <w:p>
       <w:r>
-        <w:t>The comparison also clarifies the project's intended contribution. A dataset paper can provide a resource, an architecture paper can provide a representation method, and a reporting guideline can improve transparency. KneeAssist AI combines these kinds of work into an inspectable application. The local evidence must establish whether that combination behaves adequately; citations cannot substitute for the missing experiment.</w:t>
+        <w:t>The comparison also clarifies the project's intended contribution. A dataset paper can provide a resource, an architecture paper can provide a representation method, and a reporting guideline can improve transparency. KneeAssist XAI combines these kinds of work into an inspectable application. The local evidence must establish whether that combination behaves adequately; citations cannot substitute for the missing experiment.</w:t>
       </w:r>
     </w:p>
     <w:p>
@@ -3992,7 +3992,7 @@
     </w:p>
     <w:p>
       <w:r>
-        <w:t>CRISP-DM is used to structure the work into six connected stages. Problem understanding defines the three findings and research-only use. Data understanding identifies which labels each source can support. Preparation converts supported studies into reproducible inputs. Modelling performs the primary two-encoder comparison and records the later five-family benchmark separately. Evaluation examines internal and external-reference behaviour. Deployment packages the selected model within a local interface (Chapman et al., 2000).</w:t>
+        <w:t>CRISP-DM structures six connected stages. Problem understanding defines the three findings and research-only use. Data understanding identifies supported labels. Preparation converts supported studies into reproducible inputs. Modelling performs the formal two-encoder comparison and preserves the later five-family portfolio separately. Evaluation examines internal and external-reference behaviour. Deployment packages a prevalidated target-routing registry in the local interface; the registry decision is made before a case is uploaded (Chapman et al., 2000).</w:t>
       </w:r>
     </w:p>
     <w:p>
@@ -5013,7 +5013,7 @@
     </w:p>
     <w:p>
       <w:r>
-        <w:t>Both ResNet-18 and EfficientNet-B0 use ImageNet-pretrained slice encoders. The study head has a 128-unit hidden layer, ReLU activation, dropout of 0.5 and three output logits. This is a multi-label architecture: a study can receive more than one positive finding. The code separates data loading, modelling, evaluation and inference so that an additional verified target could be introduced through an explicitly retrained model.</w:t>
+        <w:t>The formal baseline comparison uses ImageNet-pretrained ResNet-18 and EfficientNet-B0 slice encoders with study-level slice aggregation. The current dashboard registry holds separately trained, compatible models for the three displayed targets: DenseNet-121 for general abnormality, ResNet-18 for ACL and Swin-T for meniscus. It selects each model from pre-upload validation evidence and available MRI planes, never from which model gives the highest score for the current case.</w:t>
       </w:r>
     </w:p>
     <w:p>
@@ -5175,7 +5175,7 @@
     </w:p>
     <w:p>
       <w:r>
-        <w:t>Results are organised by the five objectives and drawn from the preserved run artifacts. Figures reproduce project-generated outputs rather than illustrative performance. Numerical values are rounded for presentation. The selected model is the calibrated EfficientNet-B0 frozen warm-up checkpoint, and the main evaluation set is the 120-study MRNet official validation partition.</w:t>
+        <w:t>Results are organised by the five objectives and drawn from the preserved run artifacts. Figures reproduce project-generated outputs rather than illustrative performance. Numerical values are rounded for presentation. The formal two-model objective uses the calibrated EfficientNet-B0 baseline and the 120-study MRNet official-validation partition. The current dashboard is a separate fixed target-routing implementation; its routed development metrics are reported separately below. Neither evidence set is an independent clinical test.</w:t>
       </w:r>
     </w:p>
     <w:p>
@@ -5577,7 +5577,7 @@
     </w:p>
     <w:p>
       <w:r>
-        <w:t>After the primary selection, a supplementary frozen-encoder benchmark compared five MRNet-only candidates on one locked internal-tuning split: ResNet-18 (0.8393), ResNet-50 (0.8275), DenseNet-121 (0.8354), EfficientNet-B0 (0.8472) and Swin Transformer (0.8395) macro AUROC. EfficientNet-B0 was the best new candidate, but it did not exceed the active calibrated baseline (0.8478 on the same internal criterion). The new candidate was therefore not promoted. This is a development comparison, not evidence that one architecture is clinically superior: the active model has a different historical fitting allocation, the benchmark used one seed, and no external cohort was used for selection.</w:t>
+        <w:t>After the primary selection, a supplementary frozen-encoder benchmark compared five MRNet-only candidates on one locked internal-tuning split: ResNet-18 (0.8393), ResNet-50 (0.8275), DenseNet-121 (0.8354), EfficientNet-B0 (0.8472) and Swin Transformer (0.8395) macro AUROC. EfficientNet-B0 was the strongest new macro candidate, but it did not exceed the historical calibrated EfficientNet-B0 baseline (0.8478 on the same macro criterion), so no single overall replacement was claimed. Separately, the current dashboard registry records fixed target-level routes from its own saved development evidence: DenseNet-121 for general abnormality, ResNet-18 for ACL and Swin-T for meniscus. That routing is not a weighted ensemble and is never selected from an individual uploaded study's scores. These are development comparisons, not evidence that any architecture is clinically superior: the benchmark used one seed and no independent clinical cohort was used for selection.</w:t>
       </w:r>
     </w:p>
     <w:p>
@@ -5585,7 +5585,7 @@
         <w:pStyle w:val="Heading3"/>
       </w:pPr>
       <w:r>
-        <w:t>4.2.3 Objective 3 Evaluation and calibration</w:t>
+        <w:t>4.2.3 Objective 3 Formal baseline evaluation and calibration</w:t>
       </w:r>
     </w:p>
     <w:p>
@@ -5593,7 +5593,7 @@
         <w:pStyle w:val="TableCaption"/>
       </w:pPr>
       <w:r>
-        <w:t>Table 4.2 MRNet official validation performance</w:t>
+        <w:t>Table 4.2 Formal EfficientNet-B0 baseline performance on the MRNet official-validation partition</w:t>
       </w:r>
     </w:p>
     <w:tbl>
@@ -6535,8 +6535,962 @@
       </w:pPr>
     </w:p>
     <w:p>
-      <w:r>
-        <w:t>General abnormality is the primary result for the narrowed academic topic and had the strongest observed ranking and threshold performance. Meniscal tear was weaker, with precision of 0.593 and sensitivity of 0.673; it remains an additional research output, not the main normal/abnormal claim. The macro accuracy of 0.764 must not be advertised as the probability that every finding for a new patient is correct. It averages three binary accuracies on this particular cohort.</w:t>
+      <w:pPr>
+        <w:pStyle w:val="TableCaption"/>
+      </w:pPr>
+      <w:r>
+        <w:t>Table 4.2 is the formal EfficientNet-B0 baseline evaluation used to meet the stated ResNet-18-versus-EfficientNet-B0 comparison objective. It is not the performance table for the later dashboard routing registry. General abnormality is the primary result for the narrowed academic topic and had the strongest observed ranking and threshold performance. Meniscal tear was weaker, with precision of 0.593 and sensitivity of 0.673; it remains an additional research output, not the main normal/abnormal claim. The macro accuracy of 0.764 must not be advertised as the probability that every finding for a new patient is correct. It averages three binary accuracies on this particular cohort.</w:t>
+      </w:r>
+    </w:p>
+    <w:p>
+      <w:pPr>
+        <w:pStyle w:val="TableCaption"/>
+      </w:pPr>
+      <w:r>
+        <w:t>Table 4.2a Current fixed target-routing development metrics on the previously used MRNet official-validation partition</w:t>
+      </w:r>
+    </w:p>
+    <w:tbl>
+      <w:tblPr>
+        <w:tblW w:type="auto" w:w="0"/>
+        <w:jc w:val="center"/>
+        <w:tblLayout w:type="fixed"/>
+        <w:tblLook w:firstColumn="1" w:firstRow="1" w:lastColumn="0" w:lastRow="0" w:noHBand="0" w:noVBand="1" w:val="04A0"/>
+        <w:tblBorders>
+          <w:top w:val="single" w:sz="4" w:color="D9D9D9"/>
+          <w:bottom w:val="single" w:sz="4" w:color="D9D9D9"/>
+          <w:left w:val="single" w:sz="4" w:color="D9D9D9"/>
+          <w:right w:val="single" w:sz="4" w:color="D9D9D9"/>
+          <w:insideH w:val="single" w:sz="4" w:color="D9D9D9"/>
+          <w:insideV w:val="single" w:sz="4" w:color="D9D9D9"/>
+        </w:tblBorders>
+      </w:tblPr>
+      <w:tblGrid>
+        <w:gridCol w:w="2160"/>
+        <w:gridCol w:w="1142"/>
+        <w:gridCol w:w="1142"/>
+        <w:gridCol w:w="1142"/>
+        <w:gridCol w:w="1142"/>
+        <w:gridCol w:w="1142"/>
+        <w:gridCol w:w="1142"/>
+      </w:tblGrid>
+      <w:tr>
+        <w:trPr>
+          <w:cantSplit/>
+          <w:tblHeader/>
+        </w:trPr>
+        <w:tc>
+          <w:tcPr>
+            <w:tcW w:type="dxa" w:w="2160"/>
+            <w:vAlign w:val="center"/>
+            <w:tcMar>
+              <w:top w:w="80" w:type="dxa"/>
+              <w:bottom w:w="80" w:type="dxa"/>
+              <w:left w:w="80" w:type="dxa"/>
+              <w:right w:w="80" w:type="dxa"/>
+            </w:tcMar>
+            <w:shd w:fill="E8E8E8"/>
+          </w:tcPr>
+          <w:p>
+            <w:pPr>
+              <w:spacing w:line="276" w:lineRule="auto" w:before="80" w:after="80"/>
+              <w:jc w:val="left"/>
+            </w:pPr>
+            <w:r>
+              <w:rPr>
+                <w:b/>
+                <w:sz w:val="20"/>
+              </w:rPr>
+              <w:t>Finding / active route</w:t>
+            </w:r>
+          </w:p>
+        </w:tc>
+        <w:tc>
+          <w:tcPr>
+            <w:tcW w:type="dxa" w:w="1142"/>
+            <w:vAlign w:val="center"/>
+            <w:tcMar>
+              <w:top w:w="80" w:type="dxa"/>
+              <w:bottom w:w="80" w:type="dxa"/>
+              <w:left w:w="80" w:type="dxa"/>
+              <w:right w:w="80" w:type="dxa"/>
+            </w:tcMar>
+            <w:shd w:fill="E8E8E8"/>
+          </w:tcPr>
+          <w:p>
+            <w:pPr>
+              <w:spacing w:line="276" w:lineRule="auto" w:before="80" w:after="80"/>
+              <w:jc w:val="center"/>
+            </w:pPr>
+            <w:r>
+              <w:rPr>
+                <w:b/>
+                <w:sz w:val="20"/>
+              </w:rPr>
+              <w:t>AUROC</w:t>
+            </w:r>
+          </w:p>
+        </w:tc>
+        <w:tc>
+          <w:tcPr>
+            <w:tcW w:type="dxa" w:w="1142"/>
+            <w:vAlign w:val="center"/>
+            <w:tcMar>
+              <w:top w:w="80" w:type="dxa"/>
+              <w:bottom w:w="80" w:type="dxa"/>
+              <w:left w:w="80" w:type="dxa"/>
+              <w:right w:w="80" w:type="dxa"/>
+            </w:tcMar>
+            <w:shd w:fill="E8E8E8"/>
+          </w:tcPr>
+          <w:p>
+            <w:pPr>
+              <w:spacing w:line="276" w:lineRule="auto" w:before="80" w:after="80"/>
+              <w:jc w:val="center"/>
+            </w:pPr>
+            <w:r>
+              <w:rPr>
+                <w:b/>
+                <w:sz w:val="20"/>
+              </w:rPr>
+              <w:t>F1</w:t>
+            </w:r>
+          </w:p>
+        </w:tc>
+        <w:tc>
+          <w:tcPr>
+            <w:tcW w:type="dxa" w:w="1142"/>
+            <w:vAlign w:val="center"/>
+            <w:tcMar>
+              <w:top w:w="80" w:type="dxa"/>
+              <w:bottom w:w="80" w:type="dxa"/>
+              <w:left w:w="80" w:type="dxa"/>
+              <w:right w:w="80" w:type="dxa"/>
+            </w:tcMar>
+            <w:shd w:fill="E8E8E8"/>
+          </w:tcPr>
+          <w:p>
+            <w:pPr>
+              <w:spacing w:line="276" w:lineRule="auto" w:before="80" w:after="80"/>
+              <w:jc w:val="center"/>
+            </w:pPr>
+            <w:r>
+              <w:rPr>
+                <w:b/>
+                <w:sz w:val="20"/>
+              </w:rPr>
+              <w:t>Sensitivity</w:t>
+            </w:r>
+          </w:p>
+        </w:tc>
+        <w:tc>
+          <w:tcPr>
+            <w:tcW w:type="dxa" w:w="1142"/>
+            <w:vAlign w:val="center"/>
+            <w:tcMar>
+              <w:top w:w="80" w:type="dxa"/>
+              <w:bottom w:w="80" w:type="dxa"/>
+              <w:left w:w="80" w:type="dxa"/>
+              <w:right w:w="80" w:type="dxa"/>
+            </w:tcMar>
+            <w:shd w:fill="E8E8E8"/>
+          </w:tcPr>
+          <w:p>
+            <w:pPr>
+              <w:spacing w:line="276" w:lineRule="auto" w:before="80" w:after="80"/>
+              <w:jc w:val="center"/>
+            </w:pPr>
+            <w:r>
+              <w:rPr>
+                <w:b/>
+                <w:sz w:val="20"/>
+              </w:rPr>
+              <w:t>Specificity</w:t>
+            </w:r>
+          </w:p>
+        </w:tc>
+        <w:tc>
+          <w:tcPr>
+            <w:tcW w:type="dxa" w:w="1142"/>
+            <w:vAlign w:val="center"/>
+            <w:tcMar>
+              <w:top w:w="80" w:type="dxa"/>
+              <w:bottom w:w="80" w:type="dxa"/>
+              <w:left w:w="80" w:type="dxa"/>
+              <w:right w:w="80" w:type="dxa"/>
+            </w:tcMar>
+            <w:shd w:fill="E8E8E8"/>
+          </w:tcPr>
+          <w:p>
+            <w:pPr>
+              <w:spacing w:line="276" w:lineRule="auto" w:before="80" w:after="80"/>
+              <w:jc w:val="center"/>
+            </w:pPr>
+            <w:r>
+              <w:rPr>
+                <w:b/>
+                <w:sz w:val="20"/>
+              </w:rPr>
+              <w:t>Precision</w:t>
+            </w:r>
+          </w:p>
+        </w:tc>
+        <w:tc>
+          <w:tcPr>
+            <w:tcW w:type="dxa" w:w="1142"/>
+            <w:vAlign w:val="center"/>
+            <w:tcMar>
+              <w:top w:w="80" w:type="dxa"/>
+              <w:bottom w:w="80" w:type="dxa"/>
+              <w:left w:w="80" w:type="dxa"/>
+              <w:right w:w="80" w:type="dxa"/>
+            </w:tcMar>
+            <w:shd w:fill="E8E8E8"/>
+          </w:tcPr>
+          <w:p>
+            <w:pPr>
+              <w:spacing w:line="276" w:lineRule="auto" w:before="80" w:after="80"/>
+              <w:jc w:val="center"/>
+            </w:pPr>
+            <w:r>
+              <w:rPr>
+                <w:b/>
+                <w:sz w:val="20"/>
+              </w:rPr>
+              <w:t>Accuracy</w:t>
+            </w:r>
+          </w:p>
+        </w:tc>
+      </w:tr>
+      <w:tr>
+        <w:trPr>
+          <w:cantSplit/>
+        </w:trPr>
+        <w:tc>
+          <w:tcPr>
+            <w:tcW w:type="dxa" w:w="2160"/>
+            <w:vAlign w:val="center"/>
+            <w:tcMar>
+              <w:top w:w="80" w:type="dxa"/>
+              <w:bottom w:w="80" w:type="dxa"/>
+              <w:left w:w="80" w:type="dxa"/>
+              <w:right w:w="80" w:type="dxa"/>
+            </w:tcMar>
+          </w:tcPr>
+          <w:p>
+            <w:pPr>
+              <w:spacing w:line="276" w:lineRule="auto" w:before="80" w:after="80"/>
+              <w:jc w:val="left"/>
+            </w:pPr>
+            <w:r>
+              <w:rPr>
+                <w:b w:val="0"/>
+                <w:sz w:val="20"/>
+              </w:rPr>
+              <w:t>General abnormality / DenseNet-121</w:t>
+            </w:r>
+          </w:p>
+        </w:tc>
+        <w:tc>
+          <w:tcPr>
+            <w:tcW w:type="dxa" w:w="1142"/>
+            <w:vAlign w:val="center"/>
+            <w:tcMar>
+              <w:top w:w="80" w:type="dxa"/>
+              <w:bottom w:w="80" w:type="dxa"/>
+              <w:left w:w="80" w:type="dxa"/>
+              <w:right w:w="80" w:type="dxa"/>
+            </w:tcMar>
+          </w:tcPr>
+          <w:p>
+            <w:pPr>
+              <w:spacing w:line="276" w:lineRule="auto" w:before="80" w:after="80"/>
+              <w:jc w:val="center"/>
+            </w:pPr>
+            <w:r>
+              <w:rPr>
+                <w:b w:val="0"/>
+                <w:sz w:val="20"/>
+              </w:rPr>
+              <w:t>0.861</w:t>
+            </w:r>
+          </w:p>
+        </w:tc>
+        <w:tc>
+          <w:tcPr>
+            <w:tcW w:type="dxa" w:w="1142"/>
+            <w:vAlign w:val="center"/>
+            <w:tcMar>
+              <w:top w:w="80" w:type="dxa"/>
+              <w:bottom w:w="80" w:type="dxa"/>
+              <w:left w:w="80" w:type="dxa"/>
+              <w:right w:w="80" w:type="dxa"/>
+            </w:tcMar>
+          </w:tcPr>
+          <w:p>
+            <w:pPr>
+              <w:spacing w:line="276" w:lineRule="auto" w:before="80" w:after="80"/>
+              <w:jc w:val="center"/>
+            </w:pPr>
+            <w:r>
+              <w:rPr>
+                <w:b w:val="0"/>
+                <w:sz w:val="20"/>
+              </w:rPr>
+              <w:t>0.929</w:t>
+            </w:r>
+          </w:p>
+        </w:tc>
+        <w:tc>
+          <w:tcPr>
+            <w:tcW w:type="dxa" w:w="1142"/>
+            <w:vAlign w:val="center"/>
+            <w:tcMar>
+              <w:top w:w="80" w:type="dxa"/>
+              <w:bottom w:w="80" w:type="dxa"/>
+              <w:left w:w="80" w:type="dxa"/>
+              <w:right w:w="80" w:type="dxa"/>
+            </w:tcMar>
+          </w:tcPr>
+          <w:p>
+            <w:pPr>
+              <w:spacing w:line="276" w:lineRule="auto" w:before="80" w:after="80"/>
+              <w:jc w:val="center"/>
+            </w:pPr>
+            <w:r>
+              <w:rPr>
+                <w:b w:val="0"/>
+                <w:sz w:val="20"/>
+              </w:rPr>
+              <w:t>0.968</w:t>
+            </w:r>
+          </w:p>
+        </w:tc>
+        <w:tc>
+          <w:tcPr>
+            <w:tcW w:type="dxa" w:w="1142"/>
+            <w:vAlign w:val="center"/>
+            <w:tcMar>
+              <w:top w:w="80" w:type="dxa"/>
+              <w:bottom w:w="80" w:type="dxa"/>
+              <w:left w:w="80" w:type="dxa"/>
+              <w:right w:w="80" w:type="dxa"/>
+            </w:tcMar>
+          </w:tcPr>
+          <w:p>
+            <w:pPr>
+              <w:spacing w:line="276" w:lineRule="auto" w:before="80" w:after="80"/>
+              <w:jc w:val="center"/>
+            </w:pPr>
+            <w:r>
+              <w:rPr>
+                <w:b w:val="0"/>
+                <w:sz w:val="20"/>
+              </w:rPr>
+              <w:t>0.560</w:t>
+            </w:r>
+          </w:p>
+        </w:tc>
+        <w:tc>
+          <w:tcPr>
+            <w:tcW w:type="dxa" w:w="1142"/>
+            <w:vAlign w:val="center"/>
+            <w:tcMar>
+              <w:top w:w="80" w:type="dxa"/>
+              <w:bottom w:w="80" w:type="dxa"/>
+              <w:left w:w="80" w:type="dxa"/>
+              <w:right w:w="80" w:type="dxa"/>
+            </w:tcMar>
+          </w:tcPr>
+          <w:p>
+            <w:pPr>
+              <w:spacing w:line="276" w:lineRule="auto" w:before="80" w:after="80"/>
+              <w:jc w:val="center"/>
+            </w:pPr>
+            <w:r>
+              <w:rPr>
+                <w:b w:val="0"/>
+                <w:sz w:val="20"/>
+              </w:rPr>
+              <w:t>0.893</w:t>
+            </w:r>
+          </w:p>
+        </w:tc>
+        <w:tc>
+          <w:tcPr>
+            <w:tcW w:type="dxa" w:w="1142"/>
+            <w:vAlign w:val="center"/>
+            <w:tcMar>
+              <w:top w:w="80" w:type="dxa"/>
+              <w:bottom w:w="80" w:type="dxa"/>
+              <w:left w:w="80" w:type="dxa"/>
+              <w:right w:w="80" w:type="dxa"/>
+            </w:tcMar>
+          </w:tcPr>
+          <w:p>
+            <w:pPr>
+              <w:spacing w:line="276" w:lineRule="auto" w:before="80" w:after="80"/>
+              <w:jc w:val="center"/>
+            </w:pPr>
+            <w:r>
+              <w:rPr>
+                <w:b w:val="0"/>
+                <w:sz w:val="20"/>
+              </w:rPr>
+              <w:t>0.883</w:t>
+            </w:r>
+          </w:p>
+        </w:tc>
+      </w:tr>
+      <w:tr>
+        <w:trPr>
+          <w:cantSplit/>
+        </w:trPr>
+        <w:tc>
+          <w:tcPr>
+            <w:tcW w:type="dxa" w:w="2160"/>
+            <w:vAlign w:val="center"/>
+            <w:tcMar>
+              <w:top w:w="80" w:type="dxa"/>
+              <w:bottom w:w="80" w:type="dxa"/>
+              <w:left w:w="80" w:type="dxa"/>
+              <w:right w:w="80" w:type="dxa"/>
+            </w:tcMar>
+          </w:tcPr>
+          <w:p>
+            <w:pPr>
+              <w:spacing w:line="276" w:lineRule="auto" w:before="80" w:after="80"/>
+              <w:jc w:val="left"/>
+            </w:pPr>
+            <w:r>
+              <w:rPr>
+                <w:b w:val="0"/>
+                <w:sz w:val="20"/>
+              </w:rPr>
+              <w:t>ACL tear / ResNet-18</w:t>
+            </w:r>
+          </w:p>
+        </w:tc>
+        <w:tc>
+          <w:tcPr>
+            <w:tcW w:type="dxa" w:w="1142"/>
+            <w:vAlign w:val="center"/>
+            <w:tcMar>
+              <w:top w:w="80" w:type="dxa"/>
+              <w:bottom w:w="80" w:type="dxa"/>
+              <w:left w:w="80" w:type="dxa"/>
+              <w:right w:w="80" w:type="dxa"/>
+            </w:tcMar>
+          </w:tcPr>
+          <w:p>
+            <w:pPr>
+              <w:spacing w:line="276" w:lineRule="auto" w:before="80" w:after="80"/>
+              <w:jc w:val="center"/>
+            </w:pPr>
+            <w:r>
+              <w:rPr>
+                <w:b w:val="0"/>
+                <w:sz w:val="20"/>
+              </w:rPr>
+              <w:t>0.870</w:t>
+            </w:r>
+          </w:p>
+        </w:tc>
+        <w:tc>
+          <w:tcPr>
+            <w:tcW w:type="dxa" w:w="1142"/>
+            <w:vAlign w:val="center"/>
+            <w:tcMar>
+              <w:top w:w="80" w:type="dxa"/>
+              <w:bottom w:w="80" w:type="dxa"/>
+              <w:left w:w="80" w:type="dxa"/>
+              <w:right w:w="80" w:type="dxa"/>
+            </w:tcMar>
+          </w:tcPr>
+          <w:p>
+            <w:pPr>
+              <w:spacing w:line="276" w:lineRule="auto" w:before="80" w:after="80"/>
+              <w:jc w:val="center"/>
+            </w:pPr>
+            <w:r>
+              <w:rPr>
+                <w:b w:val="0"/>
+                <w:sz w:val="20"/>
+              </w:rPr>
+              <w:t>0.763</w:t>
+            </w:r>
+          </w:p>
+        </w:tc>
+        <w:tc>
+          <w:tcPr>
+            <w:tcW w:type="dxa" w:w="1142"/>
+            <w:vAlign w:val="center"/>
+            <w:tcMar>
+              <w:top w:w="80" w:type="dxa"/>
+              <w:bottom w:w="80" w:type="dxa"/>
+              <w:left w:w="80" w:type="dxa"/>
+              <w:right w:w="80" w:type="dxa"/>
+            </w:tcMar>
+          </w:tcPr>
+          <w:p>
+            <w:pPr>
+              <w:spacing w:line="276" w:lineRule="auto" w:before="80" w:after="80"/>
+              <w:jc w:val="center"/>
+            </w:pPr>
+            <w:r>
+              <w:rPr>
+                <w:b w:val="0"/>
+                <w:sz w:val="20"/>
+              </w:rPr>
+              <w:t>0.926</w:t>
+            </w:r>
+          </w:p>
+        </w:tc>
+        <w:tc>
+          <w:tcPr>
+            <w:tcW w:type="dxa" w:w="1142"/>
+            <w:vAlign w:val="center"/>
+            <w:tcMar>
+              <w:top w:w="80" w:type="dxa"/>
+              <w:bottom w:w="80" w:type="dxa"/>
+              <w:left w:w="80" w:type="dxa"/>
+              <w:right w:w="80" w:type="dxa"/>
+            </w:tcMar>
+          </w:tcPr>
+          <w:p>
+            <w:pPr>
+              <w:spacing w:line="276" w:lineRule="auto" w:before="80" w:after="80"/>
+              <w:jc w:val="center"/>
+            </w:pPr>
+            <w:r>
+              <w:rPr>
+                <w:b w:val="0"/>
+                <w:sz w:val="20"/>
+              </w:rPr>
+              <w:t>0.591</w:t>
+            </w:r>
+          </w:p>
+        </w:tc>
+        <w:tc>
+          <w:tcPr>
+            <w:tcW w:type="dxa" w:w="1142"/>
+            <w:vAlign w:val="center"/>
+            <w:tcMar>
+              <w:top w:w="80" w:type="dxa"/>
+              <w:bottom w:w="80" w:type="dxa"/>
+              <w:left w:w="80" w:type="dxa"/>
+              <w:right w:w="80" w:type="dxa"/>
+            </w:tcMar>
+          </w:tcPr>
+          <w:p>
+            <w:pPr>
+              <w:spacing w:line="276" w:lineRule="auto" w:before="80" w:after="80"/>
+              <w:jc w:val="center"/>
+            </w:pPr>
+            <w:r>
+              <w:rPr>
+                <w:b w:val="0"/>
+                <w:sz w:val="20"/>
+              </w:rPr>
+              <w:t>0.649</w:t>
+            </w:r>
+          </w:p>
+        </w:tc>
+        <w:tc>
+          <w:tcPr>
+            <w:tcW w:type="dxa" w:w="1142"/>
+            <w:vAlign w:val="center"/>
+            <w:tcMar>
+              <w:top w:w="80" w:type="dxa"/>
+              <w:bottom w:w="80" w:type="dxa"/>
+              <w:left w:w="80" w:type="dxa"/>
+              <w:right w:w="80" w:type="dxa"/>
+            </w:tcMar>
+          </w:tcPr>
+          <w:p>
+            <w:pPr>
+              <w:spacing w:line="276" w:lineRule="auto" w:before="80" w:after="80"/>
+              <w:jc w:val="center"/>
+            </w:pPr>
+            <w:r>
+              <w:rPr>
+                <w:b w:val="0"/>
+                <w:sz w:val="20"/>
+              </w:rPr>
+              <w:t>0.742</w:t>
+            </w:r>
+          </w:p>
+        </w:tc>
+      </w:tr>
+      <w:tr>
+        <w:trPr>
+          <w:cantSplit/>
+        </w:trPr>
+        <w:tc>
+          <w:tcPr>
+            <w:tcW w:type="dxa" w:w="2160"/>
+            <w:vAlign w:val="center"/>
+            <w:tcMar>
+              <w:top w:w="80" w:type="dxa"/>
+              <w:bottom w:w="80" w:type="dxa"/>
+              <w:left w:w="80" w:type="dxa"/>
+              <w:right w:w="80" w:type="dxa"/>
+            </w:tcMar>
+          </w:tcPr>
+          <w:p>
+            <w:pPr>
+              <w:spacing w:line="276" w:lineRule="auto" w:before="80" w:after="80"/>
+              <w:jc w:val="left"/>
+            </w:pPr>
+            <w:r>
+              <w:rPr>
+                <w:b w:val="0"/>
+                <w:sz w:val="20"/>
+              </w:rPr>
+              <w:t>Meniscal tear / Swin-T</w:t>
+            </w:r>
+          </w:p>
+        </w:tc>
+        <w:tc>
+          <w:tcPr>
+            <w:tcW w:type="dxa" w:w="1142"/>
+            <w:vAlign w:val="center"/>
+            <w:tcMar>
+              <w:top w:w="80" w:type="dxa"/>
+              <w:bottom w:w="80" w:type="dxa"/>
+              <w:left w:w="80" w:type="dxa"/>
+              <w:right w:w="80" w:type="dxa"/>
+            </w:tcMar>
+          </w:tcPr>
+          <w:p>
+            <w:pPr>
+              <w:spacing w:line="276" w:lineRule="auto" w:before="80" w:after="80"/>
+              <w:jc w:val="center"/>
+            </w:pPr>
+            <w:r>
+              <w:rPr>
+                <w:b w:val="0"/>
+                <w:sz w:val="20"/>
+              </w:rPr>
+              <w:t>0.808</w:t>
+            </w:r>
+          </w:p>
+        </w:tc>
+        <w:tc>
+          <w:tcPr>
+            <w:tcW w:type="dxa" w:w="1142"/>
+            <w:vAlign w:val="center"/>
+            <w:tcMar>
+              <w:top w:w="80" w:type="dxa"/>
+              <w:bottom w:w="80" w:type="dxa"/>
+              <w:left w:w="80" w:type="dxa"/>
+              <w:right w:w="80" w:type="dxa"/>
+            </w:tcMar>
+          </w:tcPr>
+          <w:p>
+            <w:pPr>
+              <w:spacing w:line="276" w:lineRule="auto" w:before="80" w:after="80"/>
+              <w:jc w:val="center"/>
+            </w:pPr>
+            <w:r>
+              <w:rPr>
+                <w:b w:val="0"/>
+                <w:sz w:val="20"/>
+              </w:rPr>
+              <w:t>0.677</w:t>
+            </w:r>
+          </w:p>
+        </w:tc>
+        <w:tc>
+          <w:tcPr>
+            <w:tcW w:type="dxa" w:w="1142"/>
+            <w:vAlign w:val="center"/>
+            <w:tcMar>
+              <w:top w:w="80" w:type="dxa"/>
+              <w:bottom w:w="80" w:type="dxa"/>
+              <w:left w:w="80" w:type="dxa"/>
+              <w:right w:w="80" w:type="dxa"/>
+            </w:tcMar>
+          </w:tcPr>
+          <w:p>
+            <w:pPr>
+              <w:spacing w:line="276" w:lineRule="auto" w:before="80" w:after="80"/>
+              <w:jc w:val="center"/>
+            </w:pPr>
+            <w:r>
+              <w:rPr>
+                <w:b w:val="0"/>
+                <w:sz w:val="20"/>
+              </w:rPr>
+              <w:t>0.846</w:t>
+            </w:r>
+          </w:p>
+        </w:tc>
+        <w:tc>
+          <w:tcPr>
+            <w:tcW w:type="dxa" w:w="1142"/>
+            <w:vAlign w:val="center"/>
+            <w:tcMar>
+              <w:top w:w="80" w:type="dxa"/>
+              <w:bottom w:w="80" w:type="dxa"/>
+              <w:left w:w="80" w:type="dxa"/>
+              <w:right w:w="80" w:type="dxa"/>
+            </w:tcMar>
+          </w:tcPr>
+          <w:p>
+            <w:pPr>
+              <w:spacing w:line="276" w:lineRule="auto" w:before="80" w:after="80"/>
+              <w:jc w:val="center"/>
+            </w:pPr>
+            <w:r>
+              <w:rPr>
+                <w:b w:val="0"/>
+                <w:sz w:val="20"/>
+              </w:rPr>
+              <w:t>0.500</w:t>
+            </w:r>
+          </w:p>
+        </w:tc>
+        <w:tc>
+          <w:tcPr>
+            <w:tcW w:type="dxa" w:w="1142"/>
+            <w:vAlign w:val="center"/>
+            <w:tcMar>
+              <w:top w:w="80" w:type="dxa"/>
+              <w:bottom w:w="80" w:type="dxa"/>
+              <w:left w:w="80" w:type="dxa"/>
+              <w:right w:w="80" w:type="dxa"/>
+            </w:tcMar>
+          </w:tcPr>
+          <w:p>
+            <w:pPr>
+              <w:spacing w:line="276" w:lineRule="auto" w:before="80" w:after="80"/>
+              <w:jc w:val="center"/>
+            </w:pPr>
+            <w:r>
+              <w:rPr>
+                <w:b w:val="0"/>
+                <w:sz w:val="20"/>
+              </w:rPr>
+              <w:t>0.564</w:t>
+            </w:r>
+          </w:p>
+        </w:tc>
+        <w:tc>
+          <w:tcPr>
+            <w:tcW w:type="dxa" w:w="1142"/>
+            <w:vAlign w:val="center"/>
+            <w:tcMar>
+              <w:top w:w="80" w:type="dxa"/>
+              <w:bottom w:w="80" w:type="dxa"/>
+              <w:left w:w="80" w:type="dxa"/>
+              <w:right w:w="80" w:type="dxa"/>
+            </w:tcMar>
+          </w:tcPr>
+          <w:p>
+            <w:pPr>
+              <w:spacing w:line="276" w:lineRule="auto" w:before="80" w:after="80"/>
+              <w:jc w:val="center"/>
+            </w:pPr>
+            <w:r>
+              <w:rPr>
+                <w:b w:val="0"/>
+                <w:sz w:val="20"/>
+              </w:rPr>
+              <w:t>0.650</w:t>
+            </w:r>
+          </w:p>
+        </w:tc>
+      </w:tr>
+      <w:tr>
+        <w:trPr>
+          <w:cantSplit/>
+        </w:trPr>
+        <w:tc>
+          <w:tcPr>
+            <w:tcW w:type="dxa" w:w="2160"/>
+            <w:vAlign w:val="center"/>
+            <w:tcMar>
+              <w:top w:w="80" w:type="dxa"/>
+              <w:bottom w:w="80" w:type="dxa"/>
+              <w:left w:w="80" w:type="dxa"/>
+              <w:right w:w="80" w:type="dxa"/>
+            </w:tcMar>
+          </w:tcPr>
+          <w:p>
+            <w:pPr>
+              <w:spacing w:line="276" w:lineRule="auto" w:before="80" w:after="80"/>
+              <w:jc w:val="left"/>
+            </w:pPr>
+            <w:r>
+              <w:rPr>
+                <w:b w:val="0"/>
+                <w:sz w:val="20"/>
+              </w:rPr>
+              <w:t>Macro average</w:t>
+            </w:r>
+          </w:p>
+        </w:tc>
+        <w:tc>
+          <w:tcPr>
+            <w:tcW w:type="dxa" w:w="1142"/>
+            <w:vAlign w:val="center"/>
+            <w:tcMar>
+              <w:top w:w="80" w:type="dxa"/>
+              <w:bottom w:w="80" w:type="dxa"/>
+              <w:left w:w="80" w:type="dxa"/>
+              <w:right w:w="80" w:type="dxa"/>
+            </w:tcMar>
+          </w:tcPr>
+          <w:p>
+            <w:pPr>
+              <w:spacing w:line="276" w:lineRule="auto" w:before="80" w:after="80"/>
+              <w:jc w:val="center"/>
+            </w:pPr>
+            <w:r>
+              <w:rPr>
+                <w:b w:val="0"/>
+                <w:sz w:val="20"/>
+              </w:rPr>
+              <w:t>0.846</w:t>
+            </w:r>
+          </w:p>
+        </w:tc>
+        <w:tc>
+          <w:tcPr>
+            <w:tcW w:type="dxa" w:w="1142"/>
+            <w:vAlign w:val="center"/>
+            <w:tcMar>
+              <w:top w:w="80" w:type="dxa"/>
+              <w:bottom w:w="80" w:type="dxa"/>
+              <w:left w:w="80" w:type="dxa"/>
+              <w:right w:w="80" w:type="dxa"/>
+            </w:tcMar>
+          </w:tcPr>
+          <w:p>
+            <w:pPr>
+              <w:spacing w:line="276" w:lineRule="auto" w:before="80" w:after="80"/>
+              <w:jc w:val="center"/>
+            </w:pPr>
+            <w:r>
+              <w:rPr>
+                <w:b w:val="0"/>
+                <w:sz w:val="20"/>
+              </w:rPr>
+              <w:t>0.790</w:t>
+            </w:r>
+          </w:p>
+        </w:tc>
+        <w:tc>
+          <w:tcPr>
+            <w:tcW w:type="dxa" w:w="1142"/>
+            <w:vAlign w:val="center"/>
+            <w:tcMar>
+              <w:top w:w="80" w:type="dxa"/>
+              <w:bottom w:w="80" w:type="dxa"/>
+              <w:left w:w="80" w:type="dxa"/>
+              <w:right w:w="80" w:type="dxa"/>
+            </w:tcMar>
+          </w:tcPr>
+          <w:p>
+            <w:pPr>
+              <w:spacing w:line="276" w:lineRule="auto" w:before="80" w:after="80"/>
+              <w:jc w:val="center"/>
+            </w:pPr>
+            <w:r>
+              <w:rPr>
+                <w:b w:val="0"/>
+                <w:sz w:val="20"/>
+              </w:rPr>
+              <w:t>0.914</w:t>
+            </w:r>
+          </w:p>
+        </w:tc>
+        <w:tc>
+          <w:tcPr>
+            <w:tcW w:type="dxa" w:w="1142"/>
+            <w:vAlign w:val="center"/>
+            <w:tcMar>
+              <w:top w:w="80" w:type="dxa"/>
+              <w:bottom w:w="80" w:type="dxa"/>
+              <w:left w:w="80" w:type="dxa"/>
+              <w:right w:w="80" w:type="dxa"/>
+            </w:tcMar>
+          </w:tcPr>
+          <w:p>
+            <w:pPr>
+              <w:spacing w:line="276" w:lineRule="auto" w:before="80" w:after="80"/>
+              <w:jc w:val="center"/>
+            </w:pPr>
+            <w:r>
+              <w:rPr>
+                <w:b w:val="0"/>
+                <w:sz w:val="20"/>
+              </w:rPr>
+              <w:t>0.550</w:t>
+            </w:r>
+          </w:p>
+        </w:tc>
+        <w:tc>
+          <w:tcPr>
+            <w:tcW w:type="dxa" w:w="1142"/>
+            <w:vAlign w:val="center"/>
+            <w:tcMar>
+              <w:top w:w="80" w:type="dxa"/>
+              <w:bottom w:w="80" w:type="dxa"/>
+              <w:left w:w="80" w:type="dxa"/>
+              <w:right w:w="80" w:type="dxa"/>
+            </w:tcMar>
+          </w:tcPr>
+          <w:p>
+            <w:pPr>
+              <w:spacing w:line="276" w:lineRule="auto" w:before="80" w:after="80"/>
+              <w:jc w:val="center"/>
+            </w:pPr>
+            <w:r>
+              <w:rPr>
+                <w:b w:val="0"/>
+                <w:sz w:val="20"/>
+              </w:rPr>
+              <w:t>0.702</w:t>
+            </w:r>
+          </w:p>
+        </w:tc>
+        <w:tc>
+          <w:tcPr>
+            <w:tcW w:type="dxa" w:w="1142"/>
+            <w:vAlign w:val="center"/>
+            <w:tcMar>
+              <w:top w:w="80" w:type="dxa"/>
+              <w:bottom w:w="80" w:type="dxa"/>
+              <w:left w:w="80" w:type="dxa"/>
+              <w:right w:w="80" w:type="dxa"/>
+            </w:tcMar>
+          </w:tcPr>
+          <w:p>
+            <w:pPr>
+              <w:spacing w:line="276" w:lineRule="auto" w:before="80" w:after="80"/>
+              <w:jc w:val="center"/>
+            </w:pPr>
+            <w:r>
+              <w:rPr>
+                <w:b w:val="0"/>
+                <w:sz w:val="20"/>
+              </w:rPr>
+              <w:t>0.758</w:t>
+            </w:r>
+          </w:p>
+        </w:tc>
+      </w:tr>
+    </w:tbl>
+    <w:p>
+      <w:pPr>
+        <w:spacing w:after="40"/>
+      </w:pPr>
+    </w:p>
+    <w:p>
+      <w:r>
+        <w:t>The dashboard uses these three routes only after intake has identified one or more compatible MRI planes. The route is selected from the saved registry before individual prediction scores are calculated; this is not a patient-specific “winner” and not a weighted ensemble. These values were measured on the same previously used 120-study MRNet development-validation cohort, so they describe development performance rather than independent or clinical generalisation.</w:t>
       </w:r>
     </w:p>
     <w:p>
@@ -6559,7 +7513,7 @@
     </w:p>
     <w:p>
       <w:r>
-        <w:t>An example case used for workflow testing returned approximately 58.0% general abnormality, 8.6% ACL tear and 2.8% meniscal tear. These values illustrate the application's output, not a demonstration of diagnosis. A single example cannot estimate performance, and the general-abnormality value is below the selected general-abnormality threshold despite exceeding 50%.</w:t>
+        <w:t>An earlier workflow test using the historical single-model baseline recorded one set of illustrative scores. Those values are retained only as an audit record and do not describe the current target-routed dashboard, which uses separate registered models for the three findings. Dashboard scores may vary with the selected registered route and exploratory MC-dropout sampling. No single demonstration case is a performance estimate or a diagnosis; the reported evaluation tables remain the appropriate evidence.</w:t>
       </w:r>
     </w:p>
     <w:p>
@@ -9300,7 +10254,7 @@
                 <w:b w:val="0"/>
                 <w:sz w:val="20"/>
               </w:rPr>
-              <w:t>Frozen EfficientNet selected; no new candidate exceeded the active baseline</w:t>
+              <w:t>EfficientNet-B0 is the recorded formal baseline; current dashboard routing is reported separately</w:t>
             </w:r>
           </w:p>
         </w:tc>
@@ -9700,7 +10654,7 @@
     </w:p>
     <w:p>
       <w:r>
-        <w:t>KneeAssist AI fulfils the five documented objectives as a functioning and evaluated research prototype. Its most valuable output is a transparent system whose strengths and failures can both be inspected. The next step is independent, well-referenced validation and controlled improvement, not a claim that the model is ready to replace clinical judgement.</w:t>
+        <w:t>KneeAssist XAI fulfils the five documented objectives as a functioning and evaluated research prototype. Its most valuable output is a transparent system whose strengths and failures can both be inspected. The next step is independent, well-referenced validation and controlled improvement, not a claim that the model is ready to replace clinical judgement.</w:t>
       </w:r>
     </w:p>
     <w:p>

</xml_diff>